<commit_message>
Strengthen implementation-science alignment in program docs
- Doc 2 §4: name the adoption/sustainment/lifecycle language in CLO-2
  and CLO-5 as the concentration's implementation-science commitment
  made assessable.
- Doc 2 §6.4: trace the thread course by course (LEN 1 flywheel →
  LEN 3/LEN 6 application → LEN 10 capstone requirement → LEN 8 deep
  treatment with EPIS/CFIR/Active Implementation) and anchor it to
  PLO-3.4 and PLO-6.2, the two program subobjectives that name
  implementation and continuous improvement directly.
- §4.1 support map: add the PLO-3.4 / PLO-6.2 anchor notes.
- LEN 8 description: "deepens the implementation science thread that
  runs across the curriculum."
- No PLO/CLO mappings change. .docx regenerated; casebook
  introduction/about-LENS threading language kept as the named
  through-line; all editions rebuilt.

Co-Authored-By: Claude Fable 5 <noreply@anthropic.com>
Claude-Session: https://claude.ai/code/session_01Vd8woaPEeZxYsNhMGit6Eb
</commit_message>
<xml_diff>
--- a/lens_program/2_LENS_Objectives_Course_Mapping.docx
+++ b/lens_program/2_LENS_Objectives_Course_Mapping.docx
@@ -849,7 +849,7 @@
         <w:pStyle w:val="FirstParagraph"/>
       </w:pPr>
       <w:r>
-        <w:t xml:space="preserve">LENS graduates demonstrate competency across five domains. Each concentration-level objective (CLO) is written at the Analyze, Evaluate, or Create level of Bloom’s taxonomy and is structured for direct assessment. Four threads are woven across all CLOs: evidence and measurability; capability (the interface between system requirements and system impact); iterative engineering cycles at speed and scale; and communication across disciplinary and institutional boundaries. A fifth commitment, the preservation and development of human agency, serves as a design constraint across every CLO.</w:t>
+        <w:t xml:space="preserve">LENS graduates demonstrate competency across five domains. Each concentration-level objective (CLO) is written at the Analyze, Evaluate, or Create level of Bloom’s taxonomy and is structured for direct assessment. Four threads are woven across all CLOs: evidence and measurability; capability (the interface between system requirements and system impact); iterative engineering cycles at speed and scale; and communication across disciplinary and institutional boundaries. A fifth commitment, the preservation and development of human agency, serves as a design constraint across every CLO. The adoption, sustainment, and lifecycle-integration language in CLO-2 and CLO-5 is the concentration’s implementation-science commitment made assessable: interventions are engineered to survive contact with the organizations that must carry them, and the implementation evidence feeds the next iteration (Section 6.4 traces the thread course by course).</w:t>
       </w:r>
     </w:p>
     <w:p>
@@ -1840,7 +1840,7 @@
         <w:t xml:space="preserve"> </w:t>
       </w:r>
       <w:r>
-        <w:t xml:space="preserve">is carried primarily by CLO-3 (collaboration engineered as a measurable property of human-system teams; PLO-3.1, 3.5) and CLO-5 (synthesizing stakeholder requirements across disciplinary and institutional boundaries; leading adoption and sustainment, PLO-3.2, 3.3, 3.4).</w:t>
+        <w:t xml:space="preserve">is carried primarily by CLO-3 (collaboration engineered as a measurable property of human-system teams; PLO-3.1, 3.5) and CLO-5 (synthesizing stakeholder requirements across disciplinary and institutional boundaries; leading adoption and sustainment, PLO-3.2, 3.3, 3.4). PLO-3.4’s continuous-improvement leadership is where the implementation-science thread (Section 6.4) meets the program objectives directly.</w:t>
       </w:r>
     </w:p>
     <w:p>
@@ -1906,7 +1906,7 @@
         <w:t xml:space="preserve"> </w:t>
       </w:r>
       <w:r>
-        <w:t xml:space="preserve">is carried primarily by CLO-4 (instrumentation, measurement, and evaluation at operational speed and scale; PLO-6.1-6.4), CLO-2 (the evaluate-refine half of the iteration cycle; PLO-6.2), and CLO-1 (measurable capability requirements as the object of data collection; PLO-6.1).</w:t>
+        <w:t xml:space="preserve">is carried primarily by CLO-4 (instrumentation, measurement, and evaluation at operational speed and scale; PLO-6.1-6.4), CLO-2 (the evaluate-refine half of the iteration cycle; PLO-6.2), and CLO-1 (measurable capability requirements as the object of data collection; PLO-6.1). PLO-6.2 — using data to revise designs and practices for continuous improvement — is the implementation-science thread’s second direct anchor in the program objectives.</w:t>
       </w:r>
     </w:p>
     <w:p>
@@ -2558,7 +2558,7 @@
         <w:pStyle w:val="BodyText"/>
       </w:pPr>
       <w:r>
-        <w:t xml:space="preserve">Deepens the implementation science thread. Covers knowledge transfer mechanisms, organizational learning theory, adoption and sustainment of capability development interventions, and implementation science frameworks (EPIS, Active Implementation). Students analyze real organizational knowledge transfer problems, design evidence-based sustainment strategies, evaluate the operational impact of implementation approaches, and communicate recommendations to organizational leadership.</w:t>
+        <w:t xml:space="preserve">Deepens the implementation science thread that runs across the curriculum. Covers knowledge transfer mechanisms, organizational learning theory, adoption and sustainment of capability development interventions, and implementation science frameworks (EPIS, CFIR, Active Implementation). Students analyze real organizational knowledge transfer problems, design evidence-based sustainment strategies, evaluate the operational impact of implementation approaches, and communicate recommendations to organizational leadership.</w:t>
       </w:r>
     </w:p>
     <w:p>
@@ -4017,7 +4017,7 @@
         <w:pStyle w:val="BodyText"/>
       </w:pPr>
       <w:r>
-        <w:t xml:space="preserve">Implementation science (adoption, sustainment, full lifecycle): Woven through LEN 3 (Learning Engineering Systems) and LEN 10 (capstone). LEN 8 (elective) provides deeper treatment.</w:t>
+        <w:t xml:space="preserve">Implementation science (adoption, sustainment, full lifecycle): the through-line that carries capability interventions from evidence to sustained practice. Grounded in LEN 1 (the evidence-capability-performance flywheel), applied in LEN 3 (adoption, sustainment, and lifecycle integration in operational environments) and LEN 6 (problem framings revised as implementation evidence accumulates), and required in LEN 10, where the capstone’s reproducible report and governance/ethics plan must address adoption and sustainment in the partner context. LEN 8 (elective) provides the deep treatment: implementation science frameworks (EPIS, CFIR, Active Implementation) applied to real organizational knowledge-transfer problems. The thread directly supports PLO-3.4 (leading ongoing evaluation to continuously improve the selection and implementation of technologies) and PLO-6.2 (using data to revise designs, practices, and goals for continuous improvement), and it is the curricular answer to the casebook’s central implementation finding: the 17-year research-practice gap and the training-transfer literature both document that evidence does not move itself.</w:t>
       </w:r>
     </w:p>
     <w:p>
@@ -4306,6 +4306,28 @@
       </w:r>
       <w:r>
         <w:t xml:space="preserve">The five CLOs, their subobjectives, and all course mappings are unchanged from v2.1.</w:t>
+      </w:r>
+      <w:r>
+        <w:t xml:space="preserve"> </w:t>
+      </w:r>
+      <w:r>
+        <w:t xml:space="preserve">-</w:t>
+      </w:r>
+      <w:r>
+        <w:t xml:space="preserve"> </w:t>
+      </w:r>
+      <w:r>
+        <w:rPr>
+          <w:bCs/>
+          <w:b/>
+        </w:rPr>
+        <w:t xml:space="preserve">Implementation science alignment strengthened.</w:t>
+      </w:r>
+      <w:r>
+        <w:t xml:space="preserve"> </w:t>
+      </w:r>
+      <w:r>
+        <w:t xml:space="preserve">Section 4 names the adoption/sustainment/lifecycle language in CLO-2 and CLO-5 as the concentration’s implementation-science commitment made assessable. Section 6.4 traces the thread course by course (LEN 1 flywheel → LEN 3 and LEN 6 application → LEN 10 capstone requirement → LEN 8 deep treatment, with EPIS/CFIR/Active Implementation) and anchors it to PLO-3.4 and PLO-6.2, the two program subobjectives that name implementation and continuous improvement directly. No PLO/CLO mappings change; the §4.1 support map gains the two anchor notes.</w:t>
       </w:r>
     </w:p>
     <w:p>

</xml_diff>